<commit_message>
Update Word template .docx files
Replace/regenerate three binary Word template files: static/word-template/device.docx, device4.docx, and mba.docx. These updates modify the .docx templates (content/formatting) and do not affect source code.
</commit_message>
<xml_diff>
--- a/static/word-template/device4.docx
+++ b/static/word-template/device4.docx
@@ -73,7 +73,6 @@
                 <w:lang w:val="en-GB"/>
               </w:rPr>
             </w:pPr>
-            <w:proofErr w:type="gramStart"/>
             <w:r>
               <w:rPr>
                 <w:rFonts w:ascii="Arial" w:hAnsi="Arial"/>
@@ -92,7 +91,6 @@
               <w:t>imga</w:t>
             </w:r>
             <w:proofErr w:type="spellEnd"/>
-            <w:proofErr w:type="gramEnd"/>
             <w:r>
               <w:rPr>
                 <w:rFonts w:ascii="Arial" w:hAnsi="Arial"/>
@@ -122,23 +120,13 @@
                 <w:lang w:val="en-GB"/>
               </w:rPr>
             </w:pPr>
-            <w:proofErr w:type="gramStart"/>
             <w:r>
               <w:rPr>
                 <w:rFonts w:ascii="Arial" w:hAnsi="Arial"/>
                 <w:sz w:val="23"/>
                 <w:lang w:val="en-GB"/>
               </w:rPr>
-              <w:t>{{ img</w:t>
-            </w:r>
-            <w:proofErr w:type="gramEnd"/>
-            <w:r>
-              <w:rPr>
-                <w:rFonts w:ascii="Arial" w:hAnsi="Arial"/>
-                <w:sz w:val="23"/>
-                <w:lang w:val="en-GB"/>
-              </w:rPr>
-              <w:t>1 }}</w:t>
+              <w:t>{{ img1 }}</w:t>
             </w:r>
           </w:p>
         </w:tc>
@@ -156,23 +144,13 @@
                 <w:lang w:val="en-GB"/>
               </w:rPr>
             </w:pPr>
-            <w:proofErr w:type="gramStart"/>
             <w:r>
               <w:rPr>
                 <w:rFonts w:ascii="Arial" w:hAnsi="Arial"/>
                 <w:sz w:val="23"/>
                 <w:lang w:val="en-GB"/>
               </w:rPr>
-              <w:t>{{ img</w:t>
-            </w:r>
-            <w:proofErr w:type="gramEnd"/>
-            <w:r>
-              <w:rPr>
-                <w:rFonts w:ascii="Arial" w:hAnsi="Arial"/>
-                <w:sz w:val="23"/>
-                <w:lang w:val="en-GB"/>
-              </w:rPr>
-              <w:t>2 }}</w:t>
+              <w:t>{{ img2 }}</w:t>
             </w:r>
           </w:p>
         </w:tc>
@@ -190,23 +168,13 @@
                 <w:lang w:val="en-GB"/>
               </w:rPr>
             </w:pPr>
-            <w:proofErr w:type="gramStart"/>
             <w:r>
               <w:rPr>
                 <w:rFonts w:ascii="Arial" w:hAnsi="Arial"/>
                 <w:sz w:val="23"/>
                 <w:lang w:val="en-GB"/>
               </w:rPr>
-              <w:t>{{ img</w:t>
-            </w:r>
-            <w:proofErr w:type="gramEnd"/>
-            <w:r>
-              <w:rPr>
-                <w:rFonts w:ascii="Arial" w:hAnsi="Arial"/>
-                <w:sz w:val="23"/>
-                <w:lang w:val="en-GB"/>
-              </w:rPr>
-              <w:t>3 }}</w:t>
+              <w:t>{{ img3 }}</w:t>
             </w:r>
           </w:p>
         </w:tc>
@@ -229,23 +197,13 @@
                 <w:lang w:val="en-GB"/>
               </w:rPr>
             </w:pPr>
-            <w:proofErr w:type="gramStart"/>
             <w:r>
               <w:rPr>
                 <w:rFonts w:ascii="Arial" w:hAnsi="Arial"/>
                 <w:sz w:val="23"/>
                 <w:lang w:val="en-GB"/>
               </w:rPr>
-              <w:t>{{ img</w:t>
-            </w:r>
-            <w:proofErr w:type="gramEnd"/>
-            <w:r>
-              <w:rPr>
-                <w:rFonts w:ascii="Arial" w:hAnsi="Arial"/>
-                <w:sz w:val="23"/>
-                <w:lang w:val="en-GB"/>
-              </w:rPr>
-              <w:t>4 }}</w:t>
+              <w:t>{{ img4 }}</w:t>
             </w:r>
           </w:p>
         </w:tc>
@@ -263,23 +221,13 @@
                 <w:lang w:val="en-GB"/>
               </w:rPr>
             </w:pPr>
-            <w:proofErr w:type="gramStart"/>
             <w:r>
               <w:rPr>
                 <w:rFonts w:ascii="Arial" w:hAnsi="Arial"/>
                 <w:sz w:val="23"/>
                 <w:lang w:val="en-GB"/>
               </w:rPr>
-              <w:t>{{ img</w:t>
-            </w:r>
-            <w:proofErr w:type="gramEnd"/>
-            <w:r>
-              <w:rPr>
-                <w:rFonts w:ascii="Arial" w:hAnsi="Arial"/>
-                <w:sz w:val="23"/>
-                <w:lang w:val="en-GB"/>
-              </w:rPr>
-              <w:t>5 }}</w:t>
+              <w:t>{{ img5 }}</w:t>
             </w:r>
           </w:p>
         </w:tc>
@@ -297,23 +245,13 @@
                 <w:lang w:val="en-GB"/>
               </w:rPr>
             </w:pPr>
-            <w:proofErr w:type="gramStart"/>
             <w:r>
               <w:rPr>
                 <w:rFonts w:ascii="Arial" w:hAnsi="Arial"/>
                 <w:sz w:val="23"/>
                 <w:lang w:val="en-GB"/>
               </w:rPr>
-              <w:t>{{ img</w:t>
-            </w:r>
-            <w:proofErr w:type="gramEnd"/>
-            <w:r>
-              <w:rPr>
-                <w:rFonts w:ascii="Arial" w:hAnsi="Arial"/>
-                <w:sz w:val="23"/>
-                <w:lang w:val="en-GB"/>
-              </w:rPr>
-              <w:t>6 }}</w:t>
+              <w:t>{{ img6 }}</w:t>
             </w:r>
           </w:p>
         </w:tc>
@@ -321,7 +259,7 @@
     </w:tbl>
     <w:p>
       <w:pPr>
-        <w:pStyle w:val="Hinh"/>
+        <w:pStyle w:val="Danhmchnh"/>
       </w:pPr>
       <w:r>
         <w:t>Hình 4.</w:t>

</xml_diff>